<commit_message>
training: add pre-flight docs, hook setup, MCP guide, Part C materials, takeaway card
</commit_message>
<xml_diff>
--- a/_instructor/takeaway-card.docx
+++ b/_instructor/takeaway-card.docx
@@ -146,7 +146,7 @@
                 <w:sz w:val="20"/>
                 <w:szCs w:val="20"/>
               </w:rPr>
-              <w:t xml:space="preserve">  →  you work harder on every call.     </w:t>
+              <w:t xml:space="preserve">  -&gt;  you work harder on every call.     </w:t>
             </w:r>
             <w:r>
               <w:rPr>
@@ -166,7 +166,7 @@
                 <w:sz w:val="20"/>
                 <w:szCs w:val="20"/>
               </w:rPr>
-              <w:t xml:space="preserve">  →  invest once, Claude works smarter forever.</w:t>
+              <w:t xml:space="preserve">  -&gt;  invest once, Claude works smarter forever.</w:t>
             </w:r>
           </w:p>
         </w:tc>
@@ -1353,7 +1353,7 @@
                 <w:sz w:val="18"/>
                 <w:szCs w:val="18"/>
               </w:rPr>
-              <w:t xml:space="preserve">Claude reads the description and invokes the skill when relevant — or you call it directly.</w:t>
+              <w:t xml:space="preserve">Claude reads the description and invokes the skill when relevant — or call it directly.</w:t>
             </w:r>
           </w:p>
         </w:tc>
@@ -1414,7 +1414,7 @@
                 <w:sz w:val="18"/>
                 <w:szCs w:val="18"/>
               </w:rPr>
-              <w:t xml:space="preserve">scaffold-feature Shipments ArchiveShipment → spawns 3 subagents, generates full stack files.</w:t>
+              <w:t xml:space="preserve">scaffold-feature Shipments ArchiveShipment — spawns 3 subagents, generates full stack files.</w:t>
             </w:r>
           </w:p>
           <w:p>
@@ -2066,17 +2066,6 @@
               <w:t xml:space="preserve">Run the setup script once on your machine. Lives in .git/hooks/ — per developer.</w:t>
             </w:r>
           </w:p>
-          <w:p>
-            <w:r>
-              <w:rPr>
-                <w:rFonts w:ascii="Courier New" w:cs="Courier New" w:eastAsia="Courier New" w:hAnsi="Courier New"/>
-                <w:color w:val="555555"/>
-                <w:sz w:val="16"/>
-                <w:szCs w:val="16"/>
-              </w:rPr>
-              <w:t xml:space="preserve">chmod +x .git/hooks/pre-commit</w:t>
-            </w:r>
-          </w:p>
         </w:tc>
       </w:tr>
       <w:tr>
@@ -2207,7 +2196,7 @@
                 <w:sz w:val="22"/>
                 <w:szCs w:val="22"/>
               </w:rPr>
-              <w:t xml:space="preserve">Monday morning checklist</w:t>
+              <w:t xml:space="preserve">Start here on your own project</w:t>
             </w:r>
           </w:p>
           <w:p>
@@ -2221,7 +2210,7 @@
                 <w:sz w:val="18"/>
                 <w:szCs w:val="18"/>
               </w:rPr>
-              <w:t xml:space="preserve">Open your project  →  start Claude Code  →  run one real task  →  see the difference</w:t>
+              <w:t xml:space="preserve">Open your project  -&gt;  start Claude Code  -&gt;  run one real task  -&gt;  see the difference</w:t>
             </w:r>
           </w:p>
           <w:p>
@@ -2244,7 +2233,7 @@
                 <w:sz w:val="16"/>
                 <w:szCs w:val="16"/>
               </w:rPr>
-              <w:t xml:space="preserve">✓ CLAUDE.md committed     ✓ /memory enabled     ✓ settings.json in place     ✓ one skill ready     ✓ hook installed</w:t>
+              <w:t xml:space="preserve">checkmark CLAUDE.md committed     checkmark /memory enabled     checkmark settings.json in place     checkmark one skill ready     checkmark hook installed</w:t>
             </w:r>
           </w:p>
         </w:tc>

</xml_diff>